<commit_message>
docs: actualizar informe Word PDF y evidencias verificadas del 20 de octubre
</commit_message>
<xml_diff>
--- a/docs/informes/2026-10-20/MAIN_Informe_de_avances_20_octubre_2026.docx
+++ b/docs/informes/2026-10-20/MAIN_Informe_de_avances_20_octubre_2026.docx
@@ -30,7 +30,7 @@
     </w:p>
     <w:p>
       <w:r>
-        <w:t>Se amplió la administración web, se corrigió el cierre de sesión entre pestañas y se incorporó consulta de notas por curso y registro y edición docente en React. Se conservaron los aportes existentes de Michael y Pamela. La regresión de servidor aprobó 80 casos y se comprobó el flujo web con datos sintéticos. El proyecto todavía tiene funciones pendientes y no se presenta como entrega completa.</w:t>
+        <w:t>Se amplió la administración web de cuentas, cursos y matrículas con auditoría, se corrigió el cierre de sesión entre pestañas y se incorporaron notas de estudiantes y docentes en React. Se conservaron los aportes existentes de Michael y Pamela. También se verificaron adjuntos privados en Android. La regresión aprobó 96 casos de servidor y siete recorridos Android del 20/10 con datos sintéticos. El proyecto todavía tiene funciones pendientes y no se presenta como entrega completa.</w:t>
       </w:r>
     </w:p>
     <w:p>
@@ -146,7 +146,7 @@
               <w:rPr>
                 <w:sz w:val="20"/>
               </w:rPr>
-              <w:t>Proyecto Integrador MAIN de JeryBn; rama codex/main-trello-jery; main compartida conservada.</w:t>
+              <w:t>Proyecto Integrador MAIN de JeryBn; rama main; avances integrados conservando el historial.</w:t>
             </w:r>
           </w:p>
         </w:tc>
@@ -194,7 +194,7 @@
               <w:rPr>
                 <w:sz w:val="20"/>
               </w:rPr>
-              <w:t>42 tarjetas observadas. M03 y M07 pasaron a FINALIZADO con evidencia; cinco tarjetas ya estaban allí. Las demás conservan requisitos pendientes.</w:t>
+              <w:t>42 tarjetas observadas. M03, M07, M08 y M13 pasaron a FINALIZADO con evidencia; cinco tarjetas ya estaban allí. Las demás conservan requisitos pendientes.</w:t>
             </w:r>
           </w:p>
         </w:tc>
@@ -242,7 +242,7 @@
               <w:rPr>
                 <w:sz w:val="20"/>
               </w:rPr>
-              <w:t>80 pruebas de servidor sin fallos ni errores; React compilado; sesión entre pestañas y notas web comprobadas.</w:t>
+              <w:t>96 pruebas de servidor y siete recorridos Android del 20/10; línea base local de 160 lecturas sin errores y recorridos web comprobados.</w:t>
             </w:r>
           </w:p>
         </w:tc>
@@ -290,7 +290,7 @@
               <w:rPr>
                 <w:sz w:val="20"/>
               </w:rPr>
-              <w:t>6 pruebas de interfaz Android del 18/10; no se presentan como reejecutadas el 20/10.</w:t>
+              <w:t>6 pruebas de interfaz Android del 18/10 se conservan como históricas y se distinguen de la regresión actual del 20/10.</w:t>
             </w:r>
           </w:p>
         </w:tc>
@@ -338,7 +338,7 @@
               <w:rPr>
                 <w:sz w:val="20"/>
               </w:rPr>
-              <w:t>Las tarjetas M01 a M24 vencen el 20/10 a las 23:59 por planificación del grupo. Al corte de madrugada ese plazo aún no ha vencido.</w:t>
+              <w:t>Las tarjetas M01 a M24 vencen el 20/10 a las 23:59 por planificación del grupo. Al corte de revisión ese plazo aún no ha vencido.</w:t>
             </w:r>
           </w:p>
         </w:tc>
@@ -574,7 +574,7 @@
               <w:rPr>
                 <w:sz w:val="20"/>
               </w:rPr>
-              <w:t>Base HU06/HU07 y cliente Android previos, más los incrementos 9c1f734, 1136f9a, 1ce7d55, 8b087c7 y d14b7c0 del 18/10. El 20/10 se añaden 2e5684d y 54b1168.</w:t>
+              <w:t>Base HU06/HU07 y cliente Android previos, más 9c1f734, 1136f9a, 1ce7d55, 8b087c7 y d14b7c0 del 18/10. El 20/10: 2e5684d, 54b1168, b99080e y pruebas 7fc7948, además de documentación.</w:t>
             </w:r>
           </w:p>
         </w:tc>
@@ -595,7 +595,7 @@
     </w:p>
     <w:p>
       <w:r>
-        <w:t>En el alcance de Pamela se amplió el panel React existente con cuentas, parentescos, contactos y reportes y se corrigió el cierre de sesión de T11. Se añadió la web académica de cursos y notas y la edición docente. La paridad completa de mensajería, estados, IA y privacidad todavía falta.</w:t>
+        <w:t>En el alcance de Pamela se amplió el panel React con cuentas, parentescos, contactos, reportes, cursos, matrículas y auditoría y se corrigió el cierre de sesión de T11. Se añadió consulta y edición docente de notas. La paridad completa de mensajería, estados, IA y privacidad todavía falta.</w:t>
       </w:r>
     </w:p>
     <w:p>
@@ -642,6 +642,28 @@
       </w:r>
       <w:r>
         <w:t>frontend/src/academic.jsx incorpora cursos y horario, notas privadas del alumno y lista de matriculados del docente. El guardado usa expectedRecordedAt y NEW para evitar sobrescritura silenciosa. La navegación docente abre Cursos y notas; se añadió acceso visible en pantallas pequeñas.</w:t>
+      </w:r>
+    </w:p>
+    <w:p>
+      <w:r>
+        <w:rPr>
+          <w:b/>
+        </w:rPr>
+        <w:t xml:space="preserve">a43f820 195dad8 07b190b 5fb2a8b </w:t>
+      </w:r>
+      <w:r>
+        <w:t>Adjuntos privados en V9, reintentos sin duplicar y aprobación explícita del archivo; revisión web comprobada con TXT sintético. 96 pruebas backend aprobadas. Android compilado; cinco casos conjuntos y el selector real pasaron tras corregir la publicación de la descarga en el hilo de interfaz.</w:t>
+      </w:r>
+    </w:p>
+    <w:p>
+      <w:r>
+        <w:rPr>
+          <w:b/>
+        </w:rPr>
+        <w:t xml:space="preserve">b99080e y 7fc7948 </w:t>
+      </w:r>
+      <w:r>
+        <w:t>Cursos y matrículas web y API con auditoría de metadatos desde V8; ocho casos backend nuevos y un recorrido Android aprobados. Línea base local de 160 lecturas, ocho sesiones y cero errores; p95 de 14,54 ms, sin afirmar capacidad de producción.</w:t>
       </w:r>
     </w:p>
     <w:p>
@@ -695,7 +717,7 @@
         <w:t xml:space="preserve">Implementado o encontrado </w:t>
       </w:r>
       <w:r>
-        <w:t>El inventario M01 a M24 y la fecha objetivo están documentados.</w:t>
+        <w:t>El inventario M01 a M24 y la fecha objetivo están documentados. Formatos iniciales de M08 y límites de notas de voz registrados en la tarjeta.</w:t>
       </w:r>
     </w:p>
     <w:p>
@@ -747,7 +769,7 @@
         <w:t xml:space="preserve">Implementado o encontrado </w:t>
       </w:r>
       <w:r>
-        <w:t>Spring Boot concentra datos y migraciones V1 a V7; reinicio persistente probado.</w:t>
+        <w:t>Spring Boot concentra datos y migraciones V1 a V9; reinicio persistente probado.</w:t>
       </w:r>
     </w:p>
     <w:p>
@@ -1061,7 +1083,7 @@
         <w:t xml:space="preserve">Estado </w:t>
       </w:r>
       <w:r>
-        <w:t>Pendiente de implementación</w:t>
+        <w:t>Finalizado técnicamente en Trello</w:t>
       </w:r>
     </w:p>
     <w:p>
@@ -1072,7 +1094,7 @@
         <w:t xml:space="preserve">Implementado o encontrado </w:t>
       </w:r>
       <w:r>
-        <w:t>El chat disponible envía texto; la infraestructura multimedia actual corresponde a Estados.</w:t>
+        <w:t>a43f820 y 195dad8 añaden archivos privados y revisión explícita; 07b190b incorpora Android y 5fb2a8b verifica el selector real. Fotos, video con audio, audio y TXT, cancelación y reintentos comprobados.</w:t>
       </w:r>
     </w:p>
     <w:p>
@@ -1083,7 +1105,7 @@
         <w:t xml:space="preserve">Falta o límite de aceptación </w:t>
       </w:r>
       <w:r>
-        <w:t>Faltan adjuntos privados de mensajes, validación de archivos, revisión vinculada al contenido y UI Android y web. Es trabajo pendiente, no un bloqueo de acceso del usuario.</w:t>
+        <w:t>Alcance inicial definido en M01: TXT UTF8 y audio desde archivo. No PDF u Office ni grabadora interna; ampliaciones posteriores. La paridad web sigue en M21 y la prueba física en M17.</w:t>
       </w:r>
     </w:p>
     <w:p>
@@ -1304,7 +1326,7 @@
         <w:t xml:space="preserve">Falta o límite de aceptación </w:t>
       </w:r>
       <w:r>
-        <w:t>La última llamada real documentada devolvió credit_balance_exhausted / insufficient_quota. Requiere saldo del proyecto y nueva prueba exitosa; no se afirma respuesta generada.</w:t>
+        <w:t>Nueva comprobación real del 20/10: AI_QUOTA_EXHAUSTED. Requiere habilitar cuota o saldo del proyecto y repetir una respuesta exitosa. No se generó una respuesta verificada.</w:t>
       </w:r>
     </w:p>
     <w:p>
@@ -1347,7 +1369,7 @@
         <w:t xml:space="preserve">Estado </w:t>
       </w:r>
       <w:r>
-        <w:t>Administración ampliada el 20 de octubre</w:t>
+        <w:t>Finalizado técnicamente en Trello</w:t>
       </w:r>
     </w:p>
     <w:p>
@@ -1358,7 +1380,7 @@
         <w:t xml:space="preserve">Implementado o encontrado </w:t>
       </w:r>
       <w:r>
-        <w:t>Se conservan API de Michael b386291 y panel de Pamela a34efa6. 2e5684d incorpora cuentas, contactos, parentescos, reportes y recuperación.</w:t>
+        <w:t>Se conservan API de Michael b386291 y panel de Pamela a34efa6. 2e5684d incorpora cuentas y vínculos. b99080e completa cursos, matrículas y auditoría privada; la creación web y lectura Android quedaron comprobadas.</w:t>
       </w:r>
     </w:p>
     <w:p>
@@ -1369,7 +1391,7 @@
         <w:t xml:space="preserve">Falta o límite de aceptación </w:t>
       </w:r>
       <w:r>
-        <w:t>Faltan administración completa de cursos/matrículas y auditoría general de cambios. La tarjeta permanece EN PROGRESO.</w:t>
+        <w:t>No se presume aceptación académica ni despliegue MySQL real. La auditoría registra eventos desde V8 y no reconstruye cambios históricos.</w:t>
       </w:r>
     </w:p>
     <w:p>
@@ -1451,7 +1473,7 @@
         <w:t xml:space="preserve">Estado </w:t>
       </w:r>
       <w:r>
-        <w:t>Regresión ejecutada y cobertura incompleta</w:t>
+        <w:t>Regresión y línea base local comprobadas</w:t>
       </w:r>
     </w:p>
     <w:p>
@@ -1462,7 +1484,7 @@
         <w:t xml:space="preserve">Implementado o encontrado </w:t>
       </w:r>
       <w:r>
-        <w:t>El 20/10 se ejecutaron 80 casos de servidor sin fallos; React compila. Se probó cierre entre pestañas y crear/editar/consultar notas en navegador.</w:t>
+        <w:t>96 pruebas de servidor aprobadas. El 20/10 pasaron cinco casos conjuntos de adjuntos, notas y estados, uno del selector y uno de matrícula: siete recorridos, sin sumar repeticiones. Línea base local: 160 lecturas, ocho sesiones, cero errores y p95 14,54 ms.</w:t>
       </w:r>
     </w:p>
     <w:p>
@@ -1473,7 +1495,7 @@
         <w:t xml:space="preserve">Falta o límite de aceptación </w:t>
       </w:r>
       <w:r>
-        <w:t>Faltan mediciones de rendimiento/carga, validación física y pruebas de módulos todavía ausentes. Sigue PRUEBAS; 80 casos no equivalen a cobertura completa.</w:t>
+        <w:t>Faltan carga representativa de producción, validación física y módulos ausentes. Sigue PRUEBAS; la medición local excluye latencia de login y no demuestra capacidad de producción.</w:t>
       </w:r>
     </w:p>
     <w:p>
@@ -1800,7 +1822,7 @@
         <w:t xml:space="preserve">Implementado o encontrado </w:t>
       </w:r>
       <w:r>
-        <w:t>Web HU06/HU07 de Pamela conservada. 2e5684d amplía administración y 54b1168 añade cursos/notas del alumno y registro/edición por docente.</w:t>
+        <w:t>Web HU06/HU07 de Pamela conservada. 2e5684d y b99080e amplían administración; 54b1168 añade cursos/notas del alumno y registro/edición por docente.</w:t>
       </w:r>
     </w:p>
     <w:p>
@@ -1956,7 +1978,7 @@
         <w:t xml:space="preserve">Implementado o encontrado </w:t>
       </w:r>
       <w:r>
-        <w:t>Registro y edición de nota desde web y lectura del alumno usan la misma API; permisos de notas y conflictos probados en servidor.</w:t>
+        <w:t>Notas web y Android usan la misma API. El curso creado y editado desde React se vio en Android; la prueba de matrícula y revocación pasó el 20/10.</w:t>
       </w:r>
     </w:p>
     <w:p>
@@ -1967,7 +1989,7 @@
         <w:t xml:space="preserve">Falta o límite de aceptación </w:t>
       </w:r>
       <w:r>
-        <w:t>Falta recorrido Android y web simultáneo de todos los módulos, conectividad prolongada y dispositivos físicos. Las pruebas Android del 18/10 se citan como históricas.</w:t>
+        <w:t>Falta recorrido simultáneo de todos los módulos, conectividad prolongada y dispositivos físicos. Las seis pruebas Android del 18/10 se citan como históricas y se separan del caso nuevo.</w:t>
       </w:r>
     </w:p>
     <w:p>
@@ -2144,7 +2166,7 @@
               <w:rPr>
                 <w:sz w:val="20"/>
               </w:rPr>
-              <w:t>Equipo completo; estaban PRUEBAS. Base de consulta de actividades conservada; aceptación conjunta y elementos de sus checklists no se dan por aprobados automáticamente.</w:t>
+              <w:t>Equipo completo. Actividades y detalle conservados; PRUEBAS por criterios y aceptación conjunta pendientes.</w:t>
             </w:r>
           </w:p>
         </w:tc>
@@ -2192,7 +2214,7 @@
               <w:rPr>
                 <w:sz w:val="20"/>
               </w:rPr>
-              <w:t>Pamela Regina Meneses Mayhua; listado, búsqueda, filtros, detalle y navegación React existentes. Permanecen PRUEBAS a falta de cierre de criterios y aceptación.</w:t>
+              <w:t>Pamela Regina Meneses Mayhua: listado y detalle React conservados. Aceptación pendiente en PRUEBAS.</w:t>
             </w:r>
           </w:p>
         </w:tc>
@@ -2240,7 +2262,7 @@
               <w:rPr>
                 <w:sz w:val="20"/>
               </w:rPr>
-              <w:t>Michael Julian Fernandez Camarena; se ejecutó regresión de acceso y detalle en esta asistencia. Permanecen PRUEBAS; no se inventa entrega propia del integrante.</w:t>
+              <w:t>Michael Julian Fernandez Camarena: regresión ejecutada por esta asistencia. PRUEBAS; entrega propia no presumida.</w:t>
             </w:r>
           </w:p>
         </w:tc>
@@ -2288,7 +2310,7 @@
               <w:rPr>
                 <w:sz w:val="20"/>
               </w:rPr>
-              <w:t>Michael Julian Fernandez Camarena; se reconoce b386291. Su checklist y acuerdo de alcance original siguen requiriendo revisión.</w:t>
+              <w:t>Michael Julian Fernandez Camarena: b386291 reconocido. Checklist y acuerdo pendientes.</w:t>
             </w:r>
           </w:p>
         </w:tc>
@@ -2336,7 +2358,7 @@
               <w:rPr>
                 <w:sz w:val="20"/>
               </w:rPr>
-              <w:t>Pamela Regina Meneses Mayhua; panel existente reconocido; fallo de logout corregido por encargo de Jery. Permanecen PRUEBAS por criterios restantes y aceptación.</w:t>
+              <w:t>Pamela Regina Meneses Mayhua: panel conservado y logout corregido aquí. PRUEBAS por aceptación y criterios restantes.</w:t>
             </w:r>
           </w:p>
         </w:tc>
@@ -2384,7 +2406,7 @@
               <w:rPr>
                 <w:sz w:val="20"/>
               </w:rPr>
-              <w:t>Jery Becerra Ninaquispe y Michael Julian Fernandez Camarena; migraciones y persistencia local implementadas. Falta acuerdo y prueba con base compartida real.</w:t>
+              <w:t>Jery Becerra Ninaquispe y Michael Julian Fernandez Camarena: persistencia local probada; base compartida real pendiente.</w:t>
             </w:r>
           </w:p>
         </w:tc>
@@ -2432,7 +2454,7 @@
               <w:rPr>
                 <w:sz w:val="20"/>
               </w:rPr>
-              <w:t>Planificación y definición de terminado; el acuerdo del equipo no se sustituye por una declaración unilateral de esta asistencia.</w:t>
+              <w:t>Alcance, estimaciones y aceptación del equipo pendientes; esta revisión no sustituye su acuerdo.</w:t>
             </w:r>
           </w:p>
         </w:tc>
@@ -2448,7 +2470,7 @@
     </w:p>
     <w:p>
       <w:r>
-        <w:t>Servidor el 20/10: admin-community-20-oct.log y academic-web-20-oct.log registran 80 pruebas, 0 fallos, 0 errores y 0 omitidas. Incluyen aislamiento de cuentas, revocación de sesiones, grupos, revisión de contenido, notas, estados, CSRF y persistencia.</w:t>
+        <w:t>Servidor el 20/10: resume-m08-server-96.log registra 96 pruebas, 0 fallos, 0 errores y 0 omitidas. Incluye ocho casos nuevos administrativos, ocho de adjuntos y la regresión anterior de aislamiento, grupos, revisión, notas, estados, CSRF y persistencia.</w:t>
       </w:r>
     </w:p>
     <w:p>
@@ -2458,12 +2480,12 @@
     </w:p>
     <w:p>
       <w:r>
-        <w:t>Android: APK anterior instalado y actividad abierta el 20/10, emulador conectado por 8088; Android Studio abre MAINAndroid con caché aislada. Las seis pruebas de interfaz y tres pruebas de configuración citadas corresponden al 18/10.</w:t>
+        <w:t>Android el 20/10: cinco casos conjuntos de adjuntos, estados y notas y un caso de selección real aprobados; se corrigió una actualización de descarga fuera del hilo UI y se ajustó la acción del botón del selector en la prueba. AcademicAdministrationUiTest aprobada; matrícula visible y revocación comprobada. Su captura muestra también el curso creado y editado desde React. Un selector ambiguo se corrigió antes de la repetición exitosa. Las seis pruebas UI y tres de configuración del 18/10 se mantienen como históricas.</w:t>
       </w:r>
     </w:p>
     <w:p>
       <w:r>
-        <w:t>Límites: no se ejecutó prueba física, carga de producción, respaldo y restauración de MySQL ni respuesta real exitosa de OpenAI. No se ofrece una cifra global de porcentaje terminado.</w:t>
+        <w:t>Rendimiento local: 160 lecturas autenticadas, ocho sesiones, mediana 9,29 ms, p95 14,54 ms y cero errores. Login y logout excluidos de esas latencias. No se ejecutó carga de producción, prueba física, restauración MySQL ni respuesta real exitosa de OpenAI.</w:t>
       </w:r>
     </w:p>
     <w:p>
@@ -2795,7 +2817,7 @@
     </w:p>
     <w:p>
       <w:r>
-        <w:t>Adjuntos de chats; notificaciones en segundo plano; avatar; administración completa de cursos y matrículas y auditoría general; clasificación automática multimodal y apelaciones; paridad web restante; pruebas de carga y sincronización completa. Son pendientes reales de desarrollo y prueba. No se atribuyen como bloqueados únicamente por falta de una decisión del usuario.</w:t>
+        <w:t>Ampliación a PDF u Office y grabadora de voz; notificaciones en segundo plano; avatar; clasificación automática multimodal y apelaciones; paridad web restante; carga representativa y sincronización completa. Son pendientes reales de desarrollo y prueba. No se atribuyen como bloqueados únicamente por falta de una decisión del usuario.</w:t>
       </w:r>
     </w:p>
     <w:p>
@@ -2813,17 +2835,17 @@
     </w:p>
     <w:p>
       <w:r>
-        <w:t>Rama publicada https://github.com/JeryBn/Proyecto-Integrador-MAIN/tree/codex/main-trello-jery</w:t>
+        <w:t>Rama publicada https://github.com/JeryBn/Proyecto-Integrador-MAIN/tree/main</w:t>
       </w:r>
     </w:p>
     <w:p>
       <w:r>
-        <w:t>Los commits preservan el historial existente. No se hizo push forzado ni se sobrescribió main. El informe y la matriz se mantienen junto con la documentación del incremento.</w:t>
+        <w:t>Historial conservado, commits por incremento y publicación en main sin push forzado. Informe y matriz acompañan la documentación.</w:t>
       </w:r>
     </w:p>
     <w:p>
       <w:r>
-        <w:t>Tablero de referencia https://trello.com/b/vrcqu5di/2026-2-c24-a-sprint-1. La matriz de tareas adjunta contiene el enlace individual de M01 a M24. Los responsables y criterios originales están conservados en docs/ALCANCE_COMPLETO_Y_BACKLOG.md.</w:t>
+        <w:t>Tablero: https://trello.com/b/vrcqu5di/2026-2-c24-a-sprint-1. La matriz enlaza M01 a M24. Responsables y criterios originales en docs/ALCANCE_COMPLETO_Y_BACKLOG.md.</w:t>
       </w:r>
     </w:p>
     <w:sectPr>

</xml_diff>